<commit_message>
Re-render design gate package with RAID correction
Regenerates the whole design gate package from current docs/
markdown so BRD and Delivery Plan cross-references pick up the
corrected D-001/D-002 dependency status (PDF/email provider decided
in ADR-0001, not "not yet selected").
</commit_message>
<xml_diff>
--- a/gates/design/VLMS_ADR.docx
+++ b/gates/design/VLMS_ADR.docx
@@ -711,22 +711,21 @@
     </w:p>
     <w:p>
       <w:pPr>
-        <w:spacing w:after="200" w:before="0"/>
+        <w:spacing w:after="120" w:before="0"/>
       </w:pPr>
       <w:r>
         <w:rPr>
           <w:rFonts w:ascii="Arial" w:hAnsi="Arial"/>
           <w:b w:val="0"/>
-          <w:i/>
-          <w:color w:val="6B7280"/>
-          <w:sz w:val="20"/>
+          <w:i w:val="0"/>
+          <w:sz w:val="22"/>
         </w:rPr>
         <w:t>Format: Nygard / MADR (context, decision, status, consequences, alternatives).</w:t>
       </w:r>
     </w:p>
     <w:p>
       <w:pPr>
-        <w:spacing w:after="120" w:before="0"/>
+        <w:spacing w:after="200" w:before="0"/>
       </w:pPr>
       <w:r>
         <w:rPr>

</xml_diff>

<commit_message>
Re-render design gate package after review fixes
Regenerates the whole design gate package from current docs/
markdown: 4 ADRs now included, guardian-link verification and
audit-log read-tracking reflected across LLD/SEC/TEST, staging-slot
contradiction resolved, FR-001-005 and NFR-004 traced through SRS/
NFR/RTM.
</commit_message>
<xml_diff>
--- a/gates/design/VLMS_ADR.docx
+++ b/gates/design/VLMS_ADR.docx
@@ -201,7 +201,7 @@
                 <w:rFonts w:ascii="Arial" w:hAnsi="Arial"/>
                 <w:sz w:val="20"/>
               </w:rPr>
-              <w:t>1.0</w:t>
+              <w:t>1.1</w:t>
             </w:r>
           </w:p>
         </w:tc>
@@ -467,7 +467,7 @@
                 <w:rFonts w:ascii="Arial" w:hAnsi="Arial"/>
                 <w:sz w:val="20"/>
               </w:rPr>
-              <w:t>adr/0001-technology-stack.md, adr/README.md</w:t>
+              <w:t>adr/0001-technology-stack.md, adr/0002-roles-as-application-claims.md, adr/0003-scheduled-jobs-webjobs.md, adr/0004-sensitive-data-access-control.md, adr/README.md</w:t>
             </w:r>
           </w:p>
         </w:tc>
@@ -670,6 +670,80 @@
           </w:p>
         </w:tc>
       </w:tr>
+      <w:tr>
+        <w:tc>
+          <w:tcPr>
+            <w:tcW w:type="dxa" w:w="1150"/>
+            <w:shd w:val="clear" w:color="auto" w:fill="FFFFFF"/>
+          </w:tcPr>
+          <w:p>
+            <w:pPr>
+              <w:spacing w:after="40" w:before="40"/>
+            </w:pPr>
+            <w:r>
+              <w:rPr>
+                <w:rFonts w:ascii="Arial" w:hAnsi="Arial"/>
+                <w:sz w:val="20"/>
+              </w:rPr>
+              <w:t>1.1</w:t>
+            </w:r>
+          </w:p>
+        </w:tc>
+        <w:tc>
+          <w:tcPr>
+            <w:tcW w:type="dxa" w:w="1500"/>
+            <w:shd w:val="clear" w:color="auto" w:fill="FFFFFF"/>
+          </w:tcPr>
+          <w:p>
+            <w:pPr>
+              <w:spacing w:after="40" w:before="40"/>
+            </w:pPr>
+            <w:r>
+              <w:rPr>
+                <w:rFonts w:ascii="Arial" w:hAnsi="Arial"/>
+                <w:sz w:val="20"/>
+              </w:rPr>
+              <w:t>17 July 2026</w:t>
+            </w:r>
+          </w:p>
+        </w:tc>
+        <w:tc>
+          <w:tcPr>
+            <w:tcW w:type="dxa" w:w="2700"/>
+            <w:shd w:val="clear" w:color="auto" w:fill="FFFFFF"/>
+          </w:tcPr>
+          <w:p>
+            <w:pPr>
+              <w:spacing w:after="40" w:before="40"/>
+            </w:pPr>
+            <w:r>
+              <w:rPr>
+                <w:rFonts w:ascii="Arial" w:hAnsi="Arial"/>
+                <w:sz w:val="20"/>
+              </w:rPr>
+              <w:t>Philip</w:t>
+            </w:r>
+          </w:p>
+        </w:tc>
+        <w:tc>
+          <w:tcPr>
+            <w:tcW w:type="dxa" w:w="3676"/>
+            <w:shd w:val="clear" w:color="auto" w:fill="FFFFFF"/>
+          </w:tcPr>
+          <w:p>
+            <w:pPr>
+              <w:spacing w:after="40" w:before="40"/>
+            </w:pPr>
+            <w:r>
+              <w:rPr>
+                <w:rFonts w:ascii="Arial" w:hAnsi="Arial"/>
+                <w:sz w:val="20"/>
+              </w:rPr>
+              <w:t>Re-render addressing design-gate review: added ADR-0002 (roles as application claims), ADR-0003 (scheduled jobs via WebJobs), ADR-0004 (sensitive-data access control) — 4 ADRs now recorded (was 1).</w:t>
+            </w:r>
+          </w:p>
+        </w:tc>
+      </w:tr>
     </w:tbl>
     <w:p>
       <w:pPr>
@@ -711,30 +785,16 @@
     </w:p>
     <w:p>
       <w:pPr>
-        <w:spacing w:after="120" w:before="0"/>
-      </w:pPr>
-      <w:r>
-        <w:rPr>
-          <w:rFonts w:ascii="Arial" w:hAnsi="Arial"/>
-          <w:b w:val="0"/>
-          <w:i w:val="0"/>
-          <w:sz w:val="22"/>
-        </w:rPr>
-        <w:t>Format: Nygard / MADR (context, decision, status, consequences, alternatives).</w:t>
-      </w:r>
-    </w:p>
-    <w:p>
-      <w:pPr>
         <w:spacing w:after="200" w:before="0"/>
       </w:pPr>
       <w:r>
         <w:rPr>
           <w:rFonts w:ascii="Arial" w:hAnsi="Arial"/>
           <w:b w:val="0"/>
-          <w:i w:val="0"/>
+          <w:i/>
           <w:sz w:val="22"/>
         </w:rPr>
-        <w:t>ADRs are added as new decisions are made during design (adr/README.md). One ADR is recorded at this gate.</w:t>
+        <w:t>Format: Nygard / MADR (context, decision, status, consequences, alternatives). ADRs are added as new decisions are made during design (adr/README.md). Four ADRs are recorded at this gate (was one at the previous render).</w:t>
       </w:r>
     </w:p>
     <w:p>
@@ -911,7 +971,7 @@
       <w:tr>
         <w:tc>
           <w:tcPr>
-            <w:tcW w:type="dxa" w:w="2200"/>
+            <w:tcW w:type="dxa" w:w="2400"/>
             <w:shd w:val="clear" w:color="auto" w:fill="374151"/>
           </w:tcPr>
           <w:p>
@@ -931,7 +991,7 @@
         </w:tc>
         <w:tc>
           <w:tcPr>
-            <w:tcW w:type="dxa" w:w="6826"/>
+            <w:tcW w:type="dxa" w:w="6626"/>
             <w:shd w:val="clear" w:color="auto" w:fill="374151"/>
           </w:tcPr>
           <w:p>
@@ -953,7 +1013,7 @@
       <w:tr>
         <w:tc>
           <w:tcPr>
-            <w:tcW w:type="dxa" w:w="2200"/>
+            <w:tcW w:type="dxa" w:w="2400"/>
             <w:shd w:val="clear" w:color="auto" w:fill="F3F4F6"/>
           </w:tcPr>
           <w:p>
@@ -971,7 +1031,7 @@
         </w:tc>
         <w:tc>
           <w:tcPr>
-            <w:tcW w:type="dxa" w:w="6826"/>
+            <w:tcW w:type="dxa" w:w="6626"/>
             <w:shd w:val="clear" w:color="auto" w:fill="F3F4F6"/>
           </w:tcPr>
           <w:p>
@@ -991,7 +1051,7 @@
       <w:tr>
         <w:tc>
           <w:tcPr>
-            <w:tcW w:type="dxa" w:w="2200"/>
+            <w:tcW w:type="dxa" w:w="2400"/>
             <w:shd w:val="clear" w:color="auto" w:fill="FFFFFF"/>
           </w:tcPr>
           <w:p>
@@ -1009,7 +1069,7 @@
         </w:tc>
         <w:tc>
           <w:tcPr>
-            <w:tcW w:type="dxa" w:w="6826"/>
+            <w:tcW w:type="dxa" w:w="6626"/>
             <w:shd w:val="clear" w:color="auto" w:fill="FFFFFF"/>
           </w:tcPr>
           <w:p>
@@ -1029,7 +1089,7 @@
       <w:tr>
         <w:tc>
           <w:tcPr>
-            <w:tcW w:type="dxa" w:w="2200"/>
+            <w:tcW w:type="dxa" w:w="2400"/>
             <w:shd w:val="clear" w:color="auto" w:fill="F3F4F6"/>
           </w:tcPr>
           <w:p>
@@ -1047,7 +1107,7 @@
         </w:tc>
         <w:tc>
           <w:tcPr>
-            <w:tcW w:type="dxa" w:w="6826"/>
+            <w:tcW w:type="dxa" w:w="6626"/>
             <w:shd w:val="clear" w:color="auto" w:fill="F3F4F6"/>
           </w:tcPr>
           <w:p>
@@ -1067,7 +1127,7 @@
       <w:tr>
         <w:tc>
           <w:tcPr>
-            <w:tcW w:type="dxa" w:w="2200"/>
+            <w:tcW w:type="dxa" w:w="2400"/>
             <w:shd w:val="clear" w:color="auto" w:fill="FFFFFF"/>
           </w:tcPr>
           <w:p>
@@ -1085,7 +1145,7 @@
         </w:tc>
         <w:tc>
           <w:tcPr>
-            <w:tcW w:type="dxa" w:w="6826"/>
+            <w:tcW w:type="dxa" w:w="6626"/>
             <w:shd w:val="clear" w:color="auto" w:fill="FFFFFF"/>
           </w:tcPr>
           <w:p>
@@ -1097,7 +1157,7 @@
                 <w:rFonts w:ascii="Arial" w:hAnsi="Arial"/>
                 <w:sz w:val="20"/>
               </w:rPr>
-              <w:t>Microsoft Entra External ID (CIAM) for all six roles' sign-in</w:t>
+              <w:t>Microsoft Entra External ID (CIAM) for Teacher/Approver/Parent/Student/Safeguarding Officer/Admin sign-in</w:t>
             </w:r>
           </w:p>
         </w:tc>
@@ -1105,7 +1165,7 @@
       <w:tr>
         <w:tc>
           <w:tcPr>
-            <w:tcW w:type="dxa" w:w="2200"/>
+            <w:tcW w:type="dxa" w:w="2400"/>
             <w:shd w:val="clear" w:color="auto" w:fill="F3F4F6"/>
           </w:tcPr>
           <w:p>
@@ -1123,7 +1183,7 @@
         </w:tc>
         <w:tc>
           <w:tcPr>
-            <w:tcW w:type="dxa" w:w="6826"/>
+            <w:tcW w:type="dxa" w:w="6626"/>
             <w:shd w:val="clear" w:color="auto" w:fill="F3F4F6"/>
           </w:tcPr>
           <w:p>
@@ -1143,7 +1203,7 @@
       <w:tr>
         <w:tc>
           <w:tcPr>
-            <w:tcW w:type="dxa" w:w="2200"/>
+            <w:tcW w:type="dxa" w:w="2400"/>
             <w:shd w:val="clear" w:color="auto" w:fill="FFFFFF"/>
           </w:tcPr>
           <w:p>
@@ -1161,7 +1221,7 @@
         </w:tc>
         <w:tc>
           <w:tcPr>
-            <w:tcW w:type="dxa" w:w="6826"/>
+            <w:tcW w:type="dxa" w:w="6626"/>
             <w:shd w:val="clear" w:color="auto" w:fill="FFFFFF"/>
           </w:tcPr>
           <w:p>
@@ -1173,7 +1233,7 @@
                 <w:rFonts w:ascii="Arial" w:hAnsi="Arial"/>
                 <w:sz w:val="20"/>
               </w:rPr>
-              <w:t>Azure Communication Services Email — transactional email</w:t>
+              <w:t>Azure Communication Services Email — transactional email (notifications, expiry reminders)</w:t>
             </w:r>
           </w:p>
         </w:tc>
@@ -1181,7 +1241,7 @@
       <w:tr>
         <w:tc>
           <w:tcPr>
-            <w:tcW w:type="dxa" w:w="2200"/>
+            <w:tcW w:type="dxa" w:w="2400"/>
             <w:shd w:val="clear" w:color="auto" w:fill="F3F4F6"/>
           </w:tcPr>
           <w:p>
@@ -1199,7 +1259,7 @@
         </w:tc>
         <w:tc>
           <w:tcPr>
-            <w:tcW w:type="dxa" w:w="6826"/>
+            <w:tcW w:type="dxa" w:w="6626"/>
             <w:shd w:val="clear" w:color="auto" w:fill="F3F4F6"/>
           </w:tcPr>
           <w:p>
@@ -1342,7 +1402,7 @@
           <w:rFonts w:ascii="Arial" w:hAnsi="Arial"/>
           <w:sz w:val="22"/>
         </w:rPr>
-        <w:t>All identity/auth work is delegated to Entra External ID; user-role mapping must be modelled as application-level authorization, not built from scratch.</w:t>
+        <w:t>All identity/auth work is delegated to Entra External ID; user-role mapping must be modelled as application-level authorization (ADR-0002), not built from scratch.</w:t>
       </w:r>
     </w:p>
     <w:p>
@@ -1381,7 +1441,569 @@
           <w:rFonts w:ascii="Arial" w:hAnsi="Arial"/>
           <w:sz w:val="22"/>
         </w:rPr>
-        <w:t>Starting tiers (App Service B1, SQL Basic/S0) are sized for tens-of-users load; scaling up is a configuration change, not a redesign, if usage grows materially beyond the ~2-year assumption (raid.md A-002).</w:t>
+        <w:t>Starting tiers (App Service B1, SQL Basic/S0) are sized for tens-of-users load; scaling up is a configuration change, not a redesign, if usage grows materially beyond the ~2-year assumption (A-002).</w:t>
+      </w:r>
+    </w:p>
+    <w:p>
+      <w:r>
+        <w:br w:type="page"/>
+      </w:r>
+    </w:p>
+    <w:p>
+      <w:pPr>
+        <w:keepNext/>
+        <w:spacing w:before="280" w:after="120"/>
+        <w:outlineLvl w:val="0"/>
+      </w:pPr>
+      <w:r>
+        <w:rPr>
+          <w:rFonts w:ascii="Arial" w:hAnsi="Arial"/>
+          <w:b/>
+          <w:color w:val="111827"/>
+          <w:sz w:val="32"/>
+        </w:rPr>
+        <w:t>ADR-0002: User roles modelled as application claims, not native Entra External ID groups</w:t>
+      </w:r>
+    </w:p>
+    <w:p>
+      <w:pPr>
+        <w:spacing w:after="120" w:before="0"/>
+      </w:pPr>
+      <w:r>
+        <w:rPr>
+          <w:rFonts w:ascii="Arial" w:hAnsi="Arial"/>
+          <w:b/>
+          <w:i w:val="0"/>
+          <w:sz w:val="22"/>
+        </w:rPr>
+        <w:t>Status: Accepted</w:t>
+      </w:r>
+    </w:p>
+    <w:p>
+      <w:pPr>
+        <w:keepNext/>
+        <w:spacing w:before="200" w:after="80"/>
+        <w:outlineLvl w:val="1"/>
+      </w:pPr>
+      <w:r>
+        <w:rPr>
+          <w:rFonts w:ascii="Arial" w:hAnsi="Arial"/>
+          <w:b/>
+          <w:color w:val="1F2937"/>
+          <w:sz w:val="26"/>
+        </w:rPr>
+        <w:t>Context</w:t>
+      </w:r>
+    </w:p>
+    <w:p>
+      <w:pPr>
+        <w:spacing w:after="120" w:before="0"/>
+      </w:pPr>
+      <w:r>
+        <w:rPr>
+          <w:rFonts w:ascii="Arial" w:hAnsi="Arial"/>
+          <w:b w:val="0"/>
+          <w:i w:val="0"/>
+          <w:sz w:val="22"/>
+        </w:rPr>
+        <w:t>VLMS uses Microsoft Entra External ID for authentication (ADR-0001). Six roles exist: Admin, Teacher, Approver, Parent, Student, Safeguarding Officer (stakeholders.md). Some authorization decisions are pure role checks (e.g. only Safeguarding Officer/Admin may view DbsCheck), but others are resource-scoped and role alone cannot express them: a Parent's access is scoped to specific Student records via StudentGuardianLink, not just ‘is a Parent’ (data-design.md).</w:t>
+      </w:r>
+    </w:p>
+    <w:p>
+      <w:pPr>
+        <w:keepNext/>
+        <w:spacing w:before="200" w:after="80"/>
+        <w:outlineLvl w:val="1"/>
+      </w:pPr>
+      <w:r>
+        <w:rPr>
+          <w:rFonts w:ascii="Arial" w:hAnsi="Arial"/>
+          <w:b/>
+          <w:color w:val="1F2937"/>
+          <w:sz w:val="26"/>
+        </w:rPr>
+        <w:t>Decision</w:t>
+      </w:r>
+    </w:p>
+    <w:p>
+      <w:pPr>
+        <w:spacing w:after="120" w:before="0"/>
+      </w:pPr>
+      <w:r>
+        <w:rPr>
+          <w:rFonts w:ascii="Arial" w:hAnsi="Arial"/>
+          <w:b w:val="0"/>
+          <w:i w:val="0"/>
+          <w:sz w:val="22"/>
+        </w:rPr>
+        <w:t>Model roles as an application-level UserRole table (AppUser 1:N UserRole), enforced through ASP.NET Core authorization policies plus resource-based handlers — not as native Entra External ID group membership.</w:t>
+      </w:r>
+    </w:p>
+    <w:p>
+      <w:pPr>
+        <w:keepNext/>
+        <w:spacing w:before="200" w:after="80"/>
+        <w:outlineLvl w:val="1"/>
+      </w:pPr>
+      <w:r>
+        <w:rPr>
+          <w:rFonts w:ascii="Arial" w:hAnsi="Arial"/>
+          <w:b/>
+          <w:color w:val="1F2937"/>
+          <w:sz w:val="26"/>
+        </w:rPr>
+        <w:t>Alternatives considered</w:t>
+      </w:r>
+    </w:p>
+    <w:p>
+      <w:pPr>
+        <w:pStyle w:val="ListBullet"/>
+        <w:spacing w:after="60"/>
+      </w:pPr>
+      <w:r>
+        <w:rPr>
+          <w:rFonts w:ascii="Arial" w:hAnsi="Arial"/>
+          <w:sz w:val="22"/>
+        </w:rPr>
+        <w:t>Native Entra External ID groups, mapped 1:1 to the six roles — rejected: groups express ‘is a member of role X’ well, but cannot express ‘is a Parent of this specific Student’, which is central to the access model. Resource-scoped authorization has to live in the application regardless, so keeping role membership there too avoids splitting the access-control model across two systems.</w:t>
+      </w:r>
+    </w:p>
+    <w:p>
+      <w:pPr>
+        <w:keepNext/>
+        <w:spacing w:before="200" w:after="80"/>
+        <w:outlineLvl w:val="1"/>
+      </w:pPr>
+      <w:r>
+        <w:rPr>
+          <w:rFonts w:ascii="Arial" w:hAnsi="Arial"/>
+          <w:b/>
+          <w:color w:val="1F2937"/>
+          <w:sz w:val="26"/>
+        </w:rPr>
+        <w:t>Consequences</w:t>
+      </w:r>
+    </w:p>
+    <w:p>
+      <w:pPr>
+        <w:pStyle w:val="ListBullet"/>
+        <w:spacing w:after="60"/>
+      </w:pPr>
+      <w:r>
+        <w:rPr>
+          <w:rFonts w:ascii="Arial" w:hAnsi="Arial"/>
+          <w:sz w:val="22"/>
+        </w:rPr>
+        <w:t>Role and resource-scope checks live in one place (Vlms.Web authorization policies + handlers), which is easier for a solo maintainer to reason about and test than a split model.</w:t>
+      </w:r>
+    </w:p>
+    <w:p>
+      <w:pPr>
+        <w:pStyle w:val="ListBullet"/>
+        <w:spacing w:after="60"/>
+      </w:pPr>
+      <w:r>
+        <w:rPr>
+          <w:rFonts w:ascii="Arial" w:hAnsi="Arial"/>
+          <w:sz w:val="22"/>
+        </w:rPr>
+        <w:t>A user's role is not visible/manageable directly from the Entra admin center — role assignment is an application feature (Admin UI), which must itself be access-controlled (only Admin can assign roles).</w:t>
+      </w:r>
+    </w:p>
+    <w:p>
+      <w:pPr>
+        <w:pStyle w:val="ListBullet"/>
+        <w:spacing w:after="60"/>
+      </w:pPr>
+      <w:r>
+        <w:rPr>
+          <w:rFonts w:ascii="Arial" w:hAnsi="Arial"/>
+          <w:sz w:val="22"/>
+        </w:rPr>
+        <w:t>If the user base later grows enough that centralised (Entra-level) role governance becomes valuable, this can be revisited without changing the data model — UserRole could be populated from Entra group claims instead of an app-managed table.</w:t>
+      </w:r>
+    </w:p>
+    <w:p>
+      <w:r>
+        <w:br w:type="page"/>
+      </w:r>
+    </w:p>
+    <w:p>
+      <w:pPr>
+        <w:keepNext/>
+        <w:spacing w:before="280" w:after="120"/>
+        <w:outlineLvl w:val="0"/>
+      </w:pPr>
+      <w:r>
+        <w:rPr>
+          <w:rFonts w:ascii="Arial" w:hAnsi="Arial"/>
+          <w:b/>
+          <w:color w:val="111827"/>
+          <w:sz w:val="32"/>
+        </w:rPr>
+        <w:t>ADR-0003: Scheduled/background work via Azure App Service WebJobs</w:t>
+      </w:r>
+    </w:p>
+    <w:p>
+      <w:pPr>
+        <w:spacing w:after="120" w:before="0"/>
+      </w:pPr>
+      <w:r>
+        <w:rPr>
+          <w:rFonts w:ascii="Arial" w:hAnsi="Arial"/>
+          <w:b/>
+          <w:i w:val="0"/>
+          <w:sz w:val="22"/>
+        </w:rPr>
+        <w:t>Status: Accepted</w:t>
+      </w:r>
+    </w:p>
+    <w:p>
+      <w:pPr>
+        <w:keepNext/>
+        <w:spacing w:before="200" w:after="80"/>
+        <w:outlineLvl w:val="1"/>
+      </w:pPr>
+      <w:r>
+        <w:rPr>
+          <w:rFonts w:ascii="Arial" w:hAnsi="Arial"/>
+          <w:b/>
+          <w:color w:val="1F2937"/>
+          <w:sz w:val="26"/>
+        </w:rPr>
+        <w:t>Context</w:t>
+      </w:r>
+    </w:p>
+    <w:p>
+      <w:pPr>
+        <w:spacing w:after="120" w:before="0"/>
+      </w:pPr>
+      <w:r>
+        <w:rPr>
+          <w:rFonts w:ascii="Arial" w:hAnsi="Arial"/>
+          <w:b w:val="0"/>
+          <w:i w:val="0"/>
+          <w:sz w:val="22"/>
+        </w:rPr>
+        <w:t>VLMS needs recurring background work: daily consent/DBS expiry monitoring with escalation, and at-risk/disengaged student flagging (8-week no-completion threshold) — see VLMS-LLD (ConsentExpiryJob). This is the only background/scheduled workload in the system; everything else is synchronous, user-triggered web request handling.</w:t>
+      </w:r>
+    </w:p>
+    <w:p>
+      <w:pPr>
+        <w:keepNext/>
+        <w:spacing w:before="200" w:after="80"/>
+        <w:outlineLvl w:val="1"/>
+      </w:pPr>
+      <w:r>
+        <w:rPr>
+          <w:rFonts w:ascii="Arial" w:hAnsi="Arial"/>
+          <w:b/>
+          <w:color w:val="1F2937"/>
+          <w:sz w:val="26"/>
+        </w:rPr>
+        <w:t>Decision</w:t>
+      </w:r>
+    </w:p>
+    <w:p>
+      <w:pPr>
+        <w:spacing w:after="120" w:before="0"/>
+      </w:pPr>
+      <w:r>
+        <w:rPr>
+          <w:rFonts w:ascii="Arial" w:hAnsi="Arial"/>
+          <w:b w:val="0"/>
+          <w:i w:val="0"/>
+          <w:sz w:val="22"/>
+        </w:rPr>
+        <w:t>Run this as an Azure App Service WebJob, co-located with the Vlms.Web App Service plan.</w:t>
+      </w:r>
+    </w:p>
+    <w:p>
+      <w:pPr>
+        <w:keepNext/>
+        <w:spacing w:before="200" w:after="80"/>
+        <w:outlineLvl w:val="1"/>
+      </w:pPr>
+      <w:r>
+        <w:rPr>
+          <w:rFonts w:ascii="Arial" w:hAnsi="Arial"/>
+          <w:b/>
+          <w:color w:val="1F2937"/>
+          <w:sz w:val="26"/>
+        </w:rPr>
+        <w:t>Alternatives considered</w:t>
+      </w:r>
+    </w:p>
+    <w:p>
+      <w:pPr>
+        <w:pStyle w:val="ListBullet"/>
+        <w:spacing w:after="60"/>
+      </w:pPr>
+      <w:r>
+        <w:rPr>
+          <w:rFonts w:ascii="Arial" w:hAnsi="Arial"/>
+          <w:sz w:val="22"/>
+        </w:rPr>
+        <w:t>Azure Functions (Timer trigger) in a separate Function App — rejected for v1: adds a second Azure resource to provision, monitor, and pay for (per RAID R-002, solo-maintainer bus-factor risk means fewer moving parts is a genuine mitigation, not just convenience), for a single daily job with no independent scaling need at tens-of-users scale.</w:t>
+      </w:r>
+    </w:p>
+    <w:p>
+      <w:pPr>
+        <w:keepNext/>
+        <w:spacing w:before="200" w:after="80"/>
+        <w:outlineLvl w:val="1"/>
+      </w:pPr>
+      <w:r>
+        <w:rPr>
+          <w:rFonts w:ascii="Arial" w:hAnsi="Arial"/>
+          <w:b/>
+          <w:color w:val="1F2937"/>
+          <w:sz w:val="26"/>
+        </w:rPr>
+        <w:t>Consequences</w:t>
+      </w:r>
+    </w:p>
+    <w:p>
+      <w:pPr>
+        <w:pStyle w:val="ListBullet"/>
+        <w:spacing w:after="60"/>
+      </w:pPr>
+      <w:r>
+        <w:rPr>
+          <w:rFonts w:ascii="Arial" w:hAnsi="Arial"/>
+          <w:sz w:val="22"/>
+        </w:rPr>
+        <w:t>The scheduled job shares the App Service plan's compute and lifecycle with the web app — a deployment of Vlms.Web also redeploys the WebJob; there is no independent scaling or failure isolation between them.</w:t>
+      </w:r>
+    </w:p>
+    <w:p>
+      <w:pPr>
+        <w:pStyle w:val="ListBullet"/>
+        <w:spacing w:after="60"/>
+      </w:pPr>
+      <w:r>
+        <w:rPr>
+          <w:rFonts w:ascii="Arial" w:hAnsi="Arial"/>
+          <w:sz w:val="22"/>
+        </w:rPr>
+        <w:t>If the background workload grows materially, migrating to Azure Functions is a contained change — it does not affect the domain logic in Vlms.Domain, only the hosting/trigger mechanism.</w:t>
+      </w:r>
+    </w:p>
+    <w:p>
+      <w:pPr>
+        <w:pStyle w:val="ListBullet"/>
+        <w:spacing w:after="60"/>
+      </w:pPr>
+      <w:r>
+        <w:rPr>
+          <w:rFonts w:ascii="Arial" w:hAnsi="Arial"/>
+          <w:sz w:val="22"/>
+        </w:rPr>
+        <w:t>WebJob failures must be monitored explicitly (e.g. Application Insights alerting) since there is no separate Functions-portal execution history to fall back on.</w:t>
+      </w:r>
+    </w:p>
+    <w:p>
+      <w:r>
+        <w:br w:type="page"/>
+      </w:r>
+    </w:p>
+    <w:p>
+      <w:pPr>
+        <w:keepNext/>
+        <w:spacing w:before="280" w:after="120"/>
+        <w:outlineLvl w:val="0"/>
+      </w:pPr>
+      <w:r>
+        <w:rPr>
+          <w:rFonts w:ascii="Arial" w:hAnsi="Arial"/>
+          <w:b/>
+          <w:color w:val="111827"/>
+          <w:sz w:val="32"/>
+        </w:rPr>
+        <w:t>ADR-0004: Sensitive data access control — EF Core global query filters + read audit log</w:t>
+      </w:r>
+    </w:p>
+    <w:p>
+      <w:pPr>
+        <w:spacing w:after="120" w:before="0"/>
+      </w:pPr>
+      <w:r>
+        <w:rPr>
+          <w:rFonts w:ascii="Arial" w:hAnsi="Arial"/>
+          <w:b/>
+          <w:i w:val="0"/>
+          <w:sz w:val="22"/>
+        </w:rPr>
+        <w:t>Status: Accepted</w:t>
+      </w:r>
+    </w:p>
+    <w:p>
+      <w:pPr>
+        <w:keepNext/>
+        <w:spacing w:before="200" w:after="80"/>
+        <w:outlineLvl w:val="1"/>
+      </w:pPr>
+      <w:r>
+        <w:rPr>
+          <w:rFonts w:ascii="Arial" w:hAnsi="Arial"/>
+          <w:b/>
+          <w:color w:val="1F2937"/>
+          <w:sz w:val="26"/>
+        </w:rPr>
+        <w:t>Context</w:t>
+      </w:r>
+    </w:p>
+    <w:p>
+      <w:pPr>
+        <w:spacing w:after="120" w:before="0"/>
+      </w:pPr>
+      <w:r>
+        <w:rPr>
+          <w:rFonts w:ascii="Arial" w:hAnsi="Arial"/>
+          <w:b w:val="0"/>
+          <w:i w:val="0"/>
+          <w:sz w:val="22"/>
+        </w:rPr>
+        <w:t>VLMS stores special-category and children's personal data directly (DbsCheck, ConsentRecord sensitive fields) with a confirmed, role-specific access model: DbsCheck is restricted entirely to Admin/Safeguarding Officer; ConsentRecord's medical/dietary-SEN/emergency-contact fields are masked from Teacher and Approver (data-design.md, security-compliance.md). A design review of this project raised two related risks: (1) if masking/restriction is implemented as an opt-in convention that each new query/report must remember to apply, one missed call site leaks sensitive data; (2) the original design logged who created or approved a safeguarding record, but nothing logged who subsequently read one — for a system whose core justification is protecting this data, an absent read-audit trail is a real control gap, not a documentation gap.</w:t>
+      </w:r>
+    </w:p>
+    <w:p>
+      <w:pPr>
+        <w:keepNext/>
+        <w:spacing w:before="200" w:after="80"/>
+        <w:outlineLvl w:val="1"/>
+      </w:pPr>
+      <w:r>
+        <w:rPr>
+          <w:rFonts w:ascii="Arial" w:hAnsi="Arial"/>
+          <w:b/>
+          <w:color w:val="1F2937"/>
+          <w:sz w:val="26"/>
+        </w:rPr>
+        <w:t>Decision</w:t>
+      </w:r>
+    </w:p>
+    <w:p>
+      <w:pPr>
+        <w:pStyle w:val="ListNumber"/>
+        <w:spacing w:after="60"/>
+      </w:pPr>
+      <w:r>
+        <w:rPr>
+          <w:rFonts w:ascii="Arial" w:hAnsi="Arial"/>
+          <w:sz w:val="22"/>
+        </w:rPr>
+        <w:t>Enforce column masking and whole-record restriction structurally via EF Core global query filters configured on the DbContext, keyed by the current caller's role. A developer cannot accidentally bypass this by writing a new query — bypassing requires an explicit, greppable IgnoreQueryFilters() call, which is itself a reviewable act.</w:t>
+      </w:r>
+    </w:p>
+    <w:p>
+      <w:pPr>
+        <w:pStyle w:val="ListNumber"/>
+        <w:spacing w:after="60"/>
+      </w:pPr>
+      <w:r>
+        <w:rPr>
+          <w:rFonts w:ascii="Arial" w:hAnsi="Arial"/>
+          <w:sz w:val="22"/>
+        </w:rPr>
+        <w:t>Add a SensitiveDataAccessLog table (data-design.md) and write an entry on every read of a DbsCheck record or a ConsentRecord's masked fields (who, what, when, view vs export).</w:t>
+      </w:r>
+    </w:p>
+    <w:p>
+      <w:pPr>
+        <w:keepNext/>
+        <w:spacing w:before="200" w:after="80"/>
+        <w:outlineLvl w:val="1"/>
+      </w:pPr>
+      <w:r>
+        <w:rPr>
+          <w:rFonts w:ascii="Arial" w:hAnsi="Arial"/>
+          <w:b/>
+          <w:color w:val="1F2937"/>
+          <w:sz w:val="26"/>
+        </w:rPr>
+        <w:t>Alternatives considered</w:t>
+      </w:r>
+    </w:p>
+    <w:p>
+      <w:pPr>
+        <w:pStyle w:val="ListBullet"/>
+        <w:spacing w:after="60"/>
+      </w:pPr>
+      <w:r>
+        <w:rPr>
+          <w:rFonts w:ascii="Arial" w:hAnsi="Arial"/>
+          <w:sz w:val="22"/>
+        </w:rPr>
+        <w:t>Per-call data-access-layer policy checks (the original design) — rejected: correct in principle, but relies on every future query author remembering to apply it; not structural.</w:t>
+      </w:r>
+    </w:p>
+    <w:p>
+      <w:pPr>
+        <w:pStyle w:val="ListBullet"/>
+        <w:spacing w:after="60"/>
+      </w:pPr>
+      <w:r>
+        <w:rPr>
+          <w:rFonts w:ascii="Arial" w:hAnsi="Arial"/>
+          <w:sz w:val="22"/>
+        </w:rPr>
+        <w:t>Database-level column encryption (e.g. Always Encrypted) — rejected for v1: adds real operational complexity (key management, limited queryability of encrypted columns) disproportionate to a solo-maintained, tens-of-users system; the EF Core filter approach gives equivalent access control for the actual threat model here (accidental over-exposure within the application, not a compromised database administrator).</w:t>
+      </w:r>
+    </w:p>
+    <w:p>
+      <w:pPr>
+        <w:keepNext/>
+        <w:spacing w:before="200" w:after="80"/>
+        <w:outlineLvl w:val="1"/>
+      </w:pPr>
+      <w:r>
+        <w:rPr>
+          <w:rFonts w:ascii="Arial" w:hAnsi="Arial"/>
+          <w:b/>
+          <w:color w:val="1F2937"/>
+          <w:sz w:val="26"/>
+        </w:rPr>
+        <w:t>Consequences</w:t>
+      </w:r>
+    </w:p>
+    <w:p>
+      <w:pPr>
+        <w:pStyle w:val="ListBullet"/>
+        <w:spacing w:after="60"/>
+      </w:pPr>
+      <w:r>
+        <w:rPr>
+          <w:rFonts w:ascii="Arial" w:hAnsi="Arial"/>
+          <w:sz w:val="22"/>
+        </w:rPr>
+        <w:t>All EF Core queries against DbsCheck/ConsentRecord must go through the shared DbContext with the filters applied; any new reporting/export feature is safe by default.</w:t>
+      </w:r>
+    </w:p>
+    <w:p>
+      <w:pPr>
+        <w:pStyle w:val="ListBullet"/>
+        <w:spacing w:after="60"/>
+      </w:pPr>
+      <w:r>
+        <w:rPr>
+          <w:rFonts w:ascii="Arial" w:hAnsi="Arial"/>
+          <w:sz w:val="22"/>
+        </w:rPr>
+        <w:t>The read-audit log adds write volume proportional to how often sensitive data is viewed — negligible at tens-of-users scale.</w:t>
+      </w:r>
+    </w:p>
+    <w:p>
+      <w:pPr>
+        <w:pStyle w:val="ListBullet"/>
+        <w:spacing w:after="60"/>
+      </w:pPr>
+      <w:r>
+        <w:rPr>
+          <w:rFonts w:ascii="Arial" w:hAnsi="Arial"/>
+          <w:sz w:val="22"/>
+        </w:rPr>
+        <w:t>OWASP ASVS 5.0's access-control and logging chapters should be checked against this mechanism at build/test time (TC-011/TC-012), not just assumed satisfied by this ADR.</w:t>
       </w:r>
     </w:p>
     <w:sectPr>

</xml_diff>

<commit_message>
Re-render design gate package after masking-mechanism fix
Regenerates the whole package: ADR-0004 rewrite, ConsentRecord/
ConsentSensitiveDetails entity split, TC-014, and the previously
blank delivery-plan and glossary documents are now populated.
</commit_message>
<xml_diff>
--- a/gates/design/VLMS_ADR.docx
+++ b/gates/design/VLMS_ADR.docx
@@ -201,7 +201,7 @@
                 <w:rFonts w:ascii="Arial" w:hAnsi="Arial"/>
                 <w:sz w:val="20"/>
               </w:rPr>
-              <w:t>1.1</w:t>
+              <w:t>1.2</w:t>
             </w:r>
           </w:p>
         </w:tc>
@@ -744,6 +744,80 @@
           </w:p>
         </w:tc>
       </w:tr>
+      <w:tr>
+        <w:tc>
+          <w:tcPr>
+            <w:tcW w:type="dxa" w:w="1150"/>
+            <w:shd w:val="clear" w:color="auto" w:fill="F3F4F6"/>
+          </w:tcPr>
+          <w:p>
+            <w:pPr>
+              <w:spacing w:after="40" w:before="40"/>
+            </w:pPr>
+            <w:r>
+              <w:rPr>
+                <w:rFonts w:ascii="Arial" w:hAnsi="Arial"/>
+                <w:sz w:val="20"/>
+              </w:rPr>
+              <w:t>1.2</w:t>
+            </w:r>
+          </w:p>
+        </w:tc>
+        <w:tc>
+          <w:tcPr>
+            <w:tcW w:type="dxa" w:w="1500"/>
+            <w:shd w:val="clear" w:color="auto" w:fill="F3F4F6"/>
+          </w:tcPr>
+          <w:p>
+            <w:pPr>
+              <w:spacing w:after="40" w:before="40"/>
+            </w:pPr>
+            <w:r>
+              <w:rPr>
+                <w:rFonts w:ascii="Arial" w:hAnsi="Arial"/>
+                <w:sz w:val="20"/>
+              </w:rPr>
+              <w:t>17 July 2026</w:t>
+            </w:r>
+          </w:p>
+        </w:tc>
+        <w:tc>
+          <w:tcPr>
+            <w:tcW w:type="dxa" w:w="2700"/>
+            <w:shd w:val="clear" w:color="auto" w:fill="F3F4F6"/>
+          </w:tcPr>
+          <w:p>
+            <w:pPr>
+              <w:spacing w:after="40" w:before="40"/>
+            </w:pPr>
+            <w:r>
+              <w:rPr>
+                <w:rFonts w:ascii="Arial" w:hAnsi="Arial"/>
+                <w:sz w:val="20"/>
+              </w:rPr>
+              <w:t>Philip</w:t>
+            </w:r>
+          </w:p>
+        </w:tc>
+        <w:tc>
+          <w:tcPr>
+            <w:tcW w:type="dxa" w:w="3676"/>
+            <w:shd w:val="clear" w:color="auto" w:fill="F3F4F6"/>
+          </w:tcPr>
+          <w:p>
+            <w:pPr>
+              <w:spacing w:after="40" w:before="40"/>
+            </w:pPr>
+            <w:r>
+              <w:rPr>
+                <w:rFonts w:ascii="Arial" w:hAnsi="Arial"/>
+                <w:sz w:val="20"/>
+              </w:rPr>
+              <w:t>Re-render: ADR-0004 rewritten in full following a second design-review pass that found the original per-column masking mechanism technically impossible; now records the ConsentRecord/ConsentSensitiveDetails entity split + EF Core global query filter + DbCommandInterceptor read-audit decision, with tamper protection and 6-year retention, and the original mechanism kept as a documented rejected alternative.</w:t>
+            </w:r>
+          </w:p>
+        </w:tc>
+      </w:tr>
     </w:tbl>
     <w:p>
       <w:pPr>
@@ -785,7 +859,7 @@
     </w:p>
     <w:p>
       <w:pPr>
-        <w:spacing w:after="200" w:before="0"/>
+        <w:spacing w:after="120" w:before="0"/>
       </w:pPr>
       <w:r>
         <w:rPr>
@@ -794,7 +868,7 @@
           <w:i/>
           <w:sz w:val="22"/>
         </w:rPr>
-        <w:t>Format: Nygard / MADR (context, decision, status, consequences, alternatives). ADRs are added as new decisions are made during design (adr/README.md). Four ADRs are recorded at this gate (was one at the previous render).</w:t>
+        <w:t>Format: Nygard / MADR (context, decision, status, consequences, alternatives). ADRs are added as new decisions are made during design (adr/README.md). Four ADRs are recorded at this gate; ADR-0004 has been revised once, at a second design review.</w:t>
       </w:r>
     </w:p>
     <w:p>
@@ -1445,11 +1519,6 @@
       </w:r>
     </w:p>
     <w:p>
-      <w:r>
-        <w:br w:type="page"/>
-      </w:r>
-    </w:p>
-    <w:p>
       <w:pPr>
         <w:keepNext/>
         <w:spacing w:before="280" w:after="120"/>
@@ -1506,7 +1575,7 @@
           <w:i w:val="0"/>
           <w:sz w:val="22"/>
         </w:rPr>
-        <w:t>VLMS uses Microsoft Entra External ID for authentication (ADR-0001). Six roles exist: Admin, Teacher, Approver, Parent, Student, Safeguarding Officer (stakeholders.md). Some authorization decisions are pure role checks (e.g. only Safeguarding Officer/Admin may view DbsCheck), but others are resource-scoped and role alone cannot express them: a Parent's access is scoped to specific Student records via StudentGuardianLink, not just ‘is a Parent’ (data-design.md).</w:t>
+        <w:t>VLMS uses Microsoft Entra External ID for authentication (ADR-0001). Six roles exist: Admin, Teacher, Approver, Parent, Student, Safeguarding Officer (stakeholders.md). Some authorization decisions are pure role checks (e.g. only Safeguarding Officer/Admin may view DbsCheck), but others are resource-scoped and role alone cannot express them: a Parent's access is scoped to specific Student records via StudentGuardianLink, not just 'is a Parent' (data-design.md).</w:t>
       </w:r>
     </w:p>
     <w:p>
@@ -1565,7 +1634,7 @@
           <w:rFonts w:ascii="Arial" w:hAnsi="Arial"/>
           <w:sz w:val="22"/>
         </w:rPr>
-        <w:t>Native Entra External ID groups, mapped 1:1 to the six roles — rejected: groups express ‘is a member of role X’ well, but cannot express ‘is a Parent of this specific Student’, which is central to the access model. Resource-scoped authorization has to live in the application regardless, so keeping role membership there too avoids splitting the access-control model across two systems.</w:t>
+        <w:t>Native Entra External ID groups, mapped 1:1 to the six roles — rejected: groups express 'is a member of role X' well, but cannot express 'is a Parent of this specific Student', which is central to the access model. Resource-scoped authorization has to live in the application regardless, so keeping role membership there too avoids splitting the access-control model across two systems.</w:t>
       </w:r>
     </w:p>
     <w:p>
@@ -1621,11 +1690,6 @@
           <w:sz w:val="22"/>
         </w:rPr>
         <w:t>If the user base later grows enough that centralised (Entra-level) role governance becomes valuable, this can be revisited without changing the data model — UserRole could be populated from Entra group claims instead of an app-managed table.</w:t>
-      </w:r>
-    </w:p>
-    <w:p>
-      <w:r>
-        <w:br w:type="page"/>
       </w:r>
     </w:p>
     <w:p>
@@ -1803,11 +1867,6 @@
       </w:r>
     </w:p>
     <w:p>
-      <w:r>
-        <w:br w:type="page"/>
-      </w:r>
-    </w:p>
-    <w:p>
       <w:pPr>
         <w:keepNext/>
         <w:spacing w:before="280" w:after="120"/>
@@ -1820,7 +1879,7 @@
           <w:color w:val="111827"/>
           <w:sz w:val="32"/>
         </w:rPr>
-        <w:t>ADR-0004: Sensitive data access control — EF Core global query filters + read audit log</w:t>
+        <w:t>ADR-0004: Sensitive data access control — entity split + EF Core query filters + read audit log</w:t>
       </w:r>
     </w:p>
     <w:p>
@@ -1834,7 +1893,7 @@
           <w:i w:val="0"/>
           <w:sz w:val="22"/>
         </w:rPr>
-        <w:t>Status: Accepted</w:t>
+        <w:t>Status: Accepted (revised after design review caught a flaw in the first version of this decision — see Context)</w:t>
       </w:r>
     </w:p>
     <w:p>
@@ -1864,7 +1923,60 @@
           <w:i w:val="0"/>
           <w:sz w:val="22"/>
         </w:rPr>
-        <w:t>VLMS stores special-category and children's personal data directly (DbsCheck, ConsentRecord sensitive fields) with a confirmed, role-specific access model: DbsCheck is restricted entirely to Admin/Safeguarding Officer; ConsentRecord's medical/dietary-SEN/emergency-contact fields are masked from Teacher and Approver (data-design.md, security-compliance.md). A design review of this project raised two related risks: (1) if masking/restriction is implemented as an opt-in convention that each new query/report must remember to apply, one missed call site leaks sensitive data; (2) the original design logged who created or approved a safeguarding record, but nothing logged who subsequently read one — for a system whose core justification is protecting this data, an absent read-audit trail is a real control gap, not a documentation gap.</w:t>
+        <w:t>VLMS stores special-category and children's personal data directly (DbsCheck, and originally three sensitive fields on ConsentRecord) with a confirmed, role-specific access model: DbsCheck is restricted entirely to Admin/Safeguarding Officer; the sensitive consent fields are masked from Teacher and Approver, who nonetheless still need ConsentRecord.Status/ExpiryDate to enforce the consent-blocks-lesson-completion rule (FR-003).</w:t>
+      </w:r>
+    </w:p>
+    <w:p>
+      <w:pPr>
+        <w:spacing w:after="120" w:before="0"/>
+      </w:pPr>
+      <w:r>
+        <w:rPr>
+          <w:rFonts w:ascii="Arial" w:hAnsi="Arial"/>
+          <w:b w:val="0"/>
+          <w:i w:val="0"/>
+          <w:sz w:val="22"/>
+        </w:rPr>
+        <w:t>A design review raised three issues, the first of which invalidated the original mechanism:</w:t>
+      </w:r>
+    </w:p>
+    <w:p>
+      <w:pPr>
+        <w:pStyle w:val="ListNumber"/>
+        <w:spacing w:after="60"/>
+      </w:pPr>
+      <w:r>
+        <w:rPr>
+          <w:rFonts w:ascii="Arial" w:hAnsi="Arial"/>
+          <w:sz w:val="22"/>
+        </w:rPr>
+        <w:t>The original decision specified EF Core global query filters to mask individual ConsentRecord columns. This is not possible: a global query filter is a row-inclusion predicate (HasQueryFilter) — it can only include or exclude an entire row, not redact specific columns within a row that a role otherwise legitimately needs (Teacher needs Status/ExpiryDate from the same row the sensitive fields lived on). The mechanism as originally specified could not deliver the masking it claimed to.</w:t>
+      </w:r>
+    </w:p>
+    <w:p>
+      <w:pPr>
+        <w:pStyle w:val="ListNumber"/>
+        <w:spacing w:after="60"/>
+      </w:pPr>
+      <w:r>
+        <w:rPr>
+          <w:rFonts w:ascii="Arial" w:hAnsi="Arial"/>
+          <w:sz w:val="22"/>
+        </w:rPr>
+        <w:t>If masking/restriction is instead implemented as an opt-in per-call convention, one missed query/report call site leaks sensitive data.</w:t>
+      </w:r>
+    </w:p>
+    <w:p>
+      <w:pPr>
+        <w:pStyle w:val="ListNumber"/>
+        <w:spacing w:after="60"/>
+      </w:pPr>
+      <w:r>
+        <w:rPr>
+          <w:rFonts w:ascii="Arial" w:hAnsi="Arial"/>
+          <w:sz w:val="22"/>
+        </w:rPr>
+        <w:t>The original design logged who created/approved a safeguarding record but nothing logged who subsequently read one.</w:t>
       </w:r>
     </w:p>
     <w:p>
@@ -1893,7 +2005,7 @@
           <w:rFonts w:ascii="Arial" w:hAnsi="Arial"/>
           <w:sz w:val="22"/>
         </w:rPr>
-        <w:t>Enforce column masking and whole-record restriction structurally via EF Core global query filters configured on the DbContext, keyed by the current caller's role. A developer cannot accidentally bypass this by writing a new query — bypassing requires an explicit, greppable IgnoreQueryFilters() call, which is itself a reviewable act.</w:t>
+        <w:t>Split ConsentRecord into two entities (design/data-design.md): ConsentRecord (status, expiry, non-sensitive consent flags — readable by Teacher/Approver) and ConsentSensitiveDetails (medical, dietary/SEN, emergency contact — 1:1 with ConsentRecord). This turns the masking requirement into the same whole-entity restriction pattern already correctly used for DbsCheck, which a query filter can actually enforce.</w:t>
       </w:r>
     </w:p>
     <w:p>
@@ -1906,7 +2018,33 @@
           <w:rFonts w:ascii="Arial" w:hAnsi="Arial"/>
           <w:sz w:val="22"/>
         </w:rPr>
-        <w:t>Add a SensitiveDataAccessLog table (data-design.md) and write an entry on every read of a DbsCheck record or a ConsentRecord's masked fields (who, what, when, view vs export).</w:t>
+        <w:t>Enforce whole-entity restriction on DbsCheck and ConsentSensitiveDetails structurally via EF Core global query filters on the DbContext, keyed by the current caller's role. Bypassing requires an explicit, greppable IgnoreQueryFilters() call — a reviewable act, not an accident.</w:t>
+      </w:r>
+    </w:p>
+    <w:p>
+      <w:pPr>
+        <w:pStyle w:val="ListNumber"/>
+        <w:spacing w:after="60"/>
+      </w:pPr>
+      <w:r>
+        <w:rPr>
+          <w:rFonts w:ascii="Arial" w:hAnsi="Arial"/>
+          <w:sz w:val="22"/>
+        </w:rPr>
+        <w:t>Add a SensitiveDataAccessLog table and write an entry on every read of DbsCheck or ConsentSensitiveDetails (who, what, when, view vs export). Write mechanism: a DbCommandInterceptor (EF Core interceptors) registered globally on the DbContext, which detects commands against these two tables and writes the audit row after successful execution — structural, not a per-repository convention that can be forgotten.</w:t>
+      </w:r>
+    </w:p>
+    <w:p>
+      <w:pPr>
+        <w:pStyle w:val="ListNumber"/>
+        <w:spacing w:after="60"/>
+      </w:pPr>
+      <w:r>
+        <w:rPr>
+          <w:rFonts w:ascii="Arial" w:hAnsi="Arial"/>
+          <w:sz w:val="22"/>
+        </w:rPr>
+        <w:t>SensitiveDataAccessLog has UPDATE/DELETE denied at the database permission level (not just an application-level 'append-only' convention), and is retained 6 years regardless of the referenced record's own retention.</w:t>
       </w:r>
     </w:p>
     <w:p>
@@ -1935,7 +2073,7 @@
           <w:rFonts w:ascii="Arial" w:hAnsi="Arial"/>
           <w:sz w:val="22"/>
         </w:rPr>
-        <w:t>Per-call data-access-layer policy checks (the original design) — rejected: correct in principle, but relies on every future query author remembering to apply it; not structural.</w:t>
+        <w:t>Per-column masking via a query filter (the original decision) — rejected: technically impossible for the reason above; kept here as a record of what was wrong, not as a live option.</w:t>
       </w:r>
     </w:p>
     <w:p>
@@ -1948,7 +2086,33 @@
           <w:rFonts w:ascii="Arial" w:hAnsi="Arial"/>
           <w:sz w:val="22"/>
         </w:rPr>
-        <w:t>Database-level column encryption (e.g. Always Encrypted) — rejected for v1: adds real operational complexity (key management, limited queryability of encrypted columns) disproportionate to a solo-maintained, tens-of-users system; the EF Core filter approach gives equivalent access control for the actual threat model here (accidental over-exposure within the application, not a compromised database administrator).</w:t>
+        <w:t>Per-call data-access-layer policy checks — rejected: correct in principle, but relies on every future query author remembering to apply it; not structural.</w:t>
+      </w:r>
+    </w:p>
+    <w:p>
+      <w:pPr>
+        <w:pStyle w:val="ListBullet"/>
+        <w:spacing w:after="60"/>
+      </w:pPr>
+      <w:r>
+        <w:rPr>
+          <w:rFonts w:ascii="Arial" w:hAnsi="Arial"/>
+          <w:sz w:val="22"/>
+        </w:rPr>
+        <w:t>Database-level column encryption (e.g. Always Encrypted) — rejected for v1: real operational complexity (key management, limited queryability) disproportionate to a solo-maintained, tens-of-users system; the entity-split + query-filter approach gives equivalent access control for the actual threat model here (accidental over-exposure within the application, not a compromised database administrator).</w:t>
+      </w:r>
+    </w:p>
+    <w:p>
+      <w:pPr>
+        <w:pStyle w:val="ListBullet"/>
+        <w:spacing w:after="60"/>
+      </w:pPr>
+      <w:r>
+        <w:rPr>
+          <w:rFonts w:ascii="Arial" w:hAnsi="Arial"/>
+          <w:sz w:val="22"/>
+        </w:rPr>
+        <w:t>A mandatory repository wrapper method for the audit log write — rejected in favour of the DbCommandInterceptor: a wrapper is opt-in by construction (a new query path could bypass it); the interceptor attaches at the DbContext level and cannot be bypassed without the same explicit IgnoreQueryFilters()-style deliberate act.</w:t>
       </w:r>
     </w:p>
     <w:p>
@@ -1977,7 +2141,7 @@
           <w:rFonts w:ascii="Arial" w:hAnsi="Arial"/>
           <w:sz w:val="22"/>
         </w:rPr>
-        <w:t>All EF Core queries against DbsCheck/ConsentRecord must go through the shared DbContext with the filters applied; any new reporting/export feature is safe by default.</w:t>
+        <w:t>All EF Core queries against DbsCheck/ConsentSensitiveDetails go through the shared DbContext with filters and the audit interceptor applied; any new reporting/export feature is safe and logged by default.</w:t>
       </w:r>
     </w:p>
     <w:p>
@@ -1990,7 +2154,7 @@
           <w:rFonts w:ascii="Arial" w:hAnsi="Arial"/>
           <w:sz w:val="22"/>
         </w:rPr>
-        <w:t>The read-audit log adds write volume proportional to how often sensitive data is viewed — negligible at tens-of-users scale.</w:t>
+        <w:t>Any code needing both consent status and sensitive details (there is currently none identified) must join ConsentRecord and ConsentSensitiveDetails explicitly and will be denied the latter unless the caller's role permits it.</w:t>
       </w:r>
     </w:p>
     <w:p>
@@ -2003,7 +2167,20 @@
           <w:rFonts w:ascii="Arial" w:hAnsi="Arial"/>
           <w:sz w:val="22"/>
         </w:rPr>
-        <w:t>OWASP ASVS 5.0's access-control and logging chapters should be checked against this mechanism at build/test time (TC-011/TC-012), not just assumed satisfied by this ADR.</w:t>
+        <w:t>The read-audit log adds write volume proportional to how often sensitive data is viewed — negligible at tens-of-users scale — and its own 6-year retention is independent of the referenced record's retention.</w:t>
+      </w:r>
+    </w:p>
+    <w:p>
+      <w:pPr>
+        <w:pStyle w:val="ListBullet"/>
+        <w:spacing w:after="60"/>
+      </w:pPr>
+      <w:r>
+        <w:rPr>
+          <w:rFonts w:ascii="Arial" w:hAnsi="Arial"/>
+          <w:sz w:val="22"/>
+        </w:rPr>
+        <w:t>OWASP ASVS 5.0's access-control and logging chapters should be checked against this mechanism at build/test time (TC-007/TC-008/TC-011), not just assumed satisfied by this ADR.</w:t>
       </w:r>
     </w:p>
     <w:sectPr>

</xml_diff>

<commit_message>
Re-render design gate package after audit-mechanism fix
Regenerates the whole package: IMaterializationInterceptor replaces
DbCommandInterceptor as the live mechanism throughout (the old name
survives only in ADR-0004's rejected-alternatives record and
existing change-history entries), and NFR-001 wording is corrected.
</commit_message>
<xml_diff>
--- a/gates/design/VLMS_ADR.docx
+++ b/gates/design/VLMS_ADR.docx
@@ -201,7 +201,7 @@
                 <w:rFonts w:ascii="Arial" w:hAnsi="Arial"/>
                 <w:sz w:val="20"/>
               </w:rPr>
-              <w:t>1.2</w:t>
+              <w:t>1.3</w:t>
             </w:r>
           </w:p>
         </w:tc>
@@ -818,6 +818,80 @@
           </w:p>
         </w:tc>
       </w:tr>
+      <w:tr>
+        <w:tc>
+          <w:tcPr>
+            <w:tcW w:type="dxa" w:w="1150"/>
+            <w:shd w:val="clear" w:color="auto" w:fill="FFFFFF"/>
+          </w:tcPr>
+          <w:p>
+            <w:pPr>
+              <w:spacing w:after="40" w:before="40"/>
+            </w:pPr>
+            <w:r>
+              <w:rPr>
+                <w:rFonts w:ascii="Arial" w:hAnsi="Arial"/>
+                <w:sz w:val="20"/>
+              </w:rPr>
+              <w:t>1.3</w:t>
+            </w:r>
+          </w:p>
+        </w:tc>
+        <w:tc>
+          <w:tcPr>
+            <w:tcW w:type="dxa" w:w="1500"/>
+            <w:shd w:val="clear" w:color="auto" w:fill="FFFFFF"/>
+          </w:tcPr>
+          <w:p>
+            <w:pPr>
+              <w:spacing w:after="40" w:before="40"/>
+            </w:pPr>
+            <w:r>
+              <w:rPr>
+                <w:rFonts w:ascii="Arial" w:hAnsi="Arial"/>
+                <w:sz w:val="20"/>
+              </w:rPr>
+              <w:t>17 July 2026</w:t>
+            </w:r>
+          </w:p>
+        </w:tc>
+        <w:tc>
+          <w:tcPr>
+            <w:tcW w:type="dxa" w:w="2700"/>
+            <w:shd w:val="clear" w:color="auto" w:fill="FFFFFF"/>
+          </w:tcPr>
+          <w:p>
+            <w:pPr>
+              <w:spacing w:after="40" w:before="40"/>
+            </w:pPr>
+            <w:r>
+              <w:rPr>
+                <w:rFonts w:ascii="Arial" w:hAnsi="Arial"/>
+                <w:sz w:val="20"/>
+              </w:rPr>
+              <w:t>Philip</w:t>
+            </w:r>
+          </w:p>
+        </w:tc>
+        <w:tc>
+          <w:tcPr>
+            <w:tcW w:type="dxa" w:w="3676"/>
+            <w:shd w:val="clear" w:color="auto" w:fill="FFFFFF"/>
+          </w:tcPr>
+          <w:p>
+            <w:pPr>
+              <w:spacing w:after="40" w:before="40"/>
+            </w:pPr>
+            <w:r>
+              <w:rPr>
+                <w:rFonts w:ascii="Arial" w:hAnsi="Arial"/>
+                <w:sz w:val="20"/>
+              </w:rPr>
+              <w:t>Re-render: ADR-0004 revised a second time following a third design-review pass (Important, not Critical — now fixed) that found the pass-2 DbCommandInterceptor audit-write mechanism itself under-specified: it operates on raw SQL/CommandText and a forward-only DbDataReader with no reliable route to a typed EntityId. Decision §3 now records an IMaterializationInterceptor instead — its InitializedInstance hook fires once per materialized entity, giving direct typed access, correct even across EF's compiled-query cache. DbCommandInterceptor and IQueryExpressionInterceptor are both recorded as rejected alternatives; Status and Context updated to reflect the two-pass revision history.</w:t>
+            </w:r>
+          </w:p>
+        </w:tc>
+      </w:tr>
     </w:tbl>
     <w:p>
       <w:pPr>
@@ -868,7 +942,7 @@
           <w:i/>
           <w:sz w:val="22"/>
         </w:rPr>
-        <w:t>Format: Nygard / MADR (context, decision, status, consequences, alternatives). ADRs are added as new decisions are made during design (adr/README.md). Four ADRs are recorded at this gate; ADR-0004 has been revised once, at a second design review.</w:t>
+        <w:t>Format: Nygard / MADR (context, decision, status, consequences, alternatives). ADRs are added as new decisions are made during design (adr/README.md). Four ADRs are recorded at this gate; ADR-0004 has been revised twice, at the second and third design reviews.</w:t>
       </w:r>
     </w:p>
     <w:p>
@@ -1045,7 +1119,7 @@
       <w:tr>
         <w:tc>
           <w:tcPr>
-            <w:tcW w:type="dxa" w:w="2400"/>
+            <w:tcW w:type="dxa" w:w="2600"/>
             <w:shd w:val="clear" w:color="auto" w:fill="374151"/>
           </w:tcPr>
           <w:p>
@@ -1065,7 +1139,7 @@
         </w:tc>
         <w:tc>
           <w:tcPr>
-            <w:tcW w:type="dxa" w:w="6626"/>
+            <w:tcW w:type="dxa" w:w="6426"/>
             <w:shd w:val="clear" w:color="auto" w:fill="374151"/>
           </w:tcPr>
           <w:p>
@@ -1087,7 +1161,7 @@
       <w:tr>
         <w:tc>
           <w:tcPr>
-            <w:tcW w:type="dxa" w:w="2400"/>
+            <w:tcW w:type="dxa" w:w="2600"/>
             <w:shd w:val="clear" w:color="auto" w:fill="F3F4F6"/>
           </w:tcPr>
           <w:p>
@@ -1105,7 +1179,7 @@
         </w:tc>
         <w:tc>
           <w:tcPr>
-            <w:tcW w:type="dxa" w:w="6626"/>
+            <w:tcW w:type="dxa" w:w="6426"/>
             <w:shd w:val="clear" w:color="auto" w:fill="F3F4F6"/>
           </w:tcPr>
           <w:p>
@@ -1125,7 +1199,7 @@
       <w:tr>
         <w:tc>
           <w:tcPr>
-            <w:tcW w:type="dxa" w:w="2400"/>
+            <w:tcW w:type="dxa" w:w="2600"/>
             <w:shd w:val="clear" w:color="auto" w:fill="FFFFFF"/>
           </w:tcPr>
           <w:p>
@@ -1143,7 +1217,7 @@
         </w:tc>
         <w:tc>
           <w:tcPr>
-            <w:tcW w:type="dxa" w:w="6626"/>
+            <w:tcW w:type="dxa" w:w="6426"/>
             <w:shd w:val="clear" w:color="auto" w:fill="FFFFFF"/>
           </w:tcPr>
           <w:p>
@@ -1163,7 +1237,7 @@
       <w:tr>
         <w:tc>
           <w:tcPr>
-            <w:tcW w:type="dxa" w:w="2400"/>
+            <w:tcW w:type="dxa" w:w="2600"/>
             <w:shd w:val="clear" w:color="auto" w:fill="F3F4F6"/>
           </w:tcPr>
           <w:p>
@@ -1181,7 +1255,7 @@
         </w:tc>
         <w:tc>
           <w:tcPr>
-            <w:tcW w:type="dxa" w:w="6626"/>
+            <w:tcW w:type="dxa" w:w="6426"/>
             <w:shd w:val="clear" w:color="auto" w:fill="F3F4F6"/>
           </w:tcPr>
           <w:p>
@@ -1201,7 +1275,7 @@
       <w:tr>
         <w:tc>
           <w:tcPr>
-            <w:tcW w:type="dxa" w:w="2400"/>
+            <w:tcW w:type="dxa" w:w="2600"/>
             <w:shd w:val="clear" w:color="auto" w:fill="FFFFFF"/>
           </w:tcPr>
           <w:p>
@@ -1219,7 +1293,7 @@
         </w:tc>
         <w:tc>
           <w:tcPr>
-            <w:tcW w:type="dxa" w:w="6626"/>
+            <w:tcW w:type="dxa" w:w="6426"/>
             <w:shd w:val="clear" w:color="auto" w:fill="FFFFFF"/>
           </w:tcPr>
           <w:p>
@@ -1239,7 +1313,7 @@
       <w:tr>
         <w:tc>
           <w:tcPr>
-            <w:tcW w:type="dxa" w:w="2400"/>
+            <w:tcW w:type="dxa" w:w="2600"/>
             <w:shd w:val="clear" w:color="auto" w:fill="F3F4F6"/>
           </w:tcPr>
           <w:p>
@@ -1257,7 +1331,7 @@
         </w:tc>
         <w:tc>
           <w:tcPr>
-            <w:tcW w:type="dxa" w:w="6626"/>
+            <w:tcW w:type="dxa" w:w="6426"/>
             <w:shd w:val="clear" w:color="auto" w:fill="F3F4F6"/>
           </w:tcPr>
           <w:p>
@@ -1277,7 +1351,7 @@
       <w:tr>
         <w:tc>
           <w:tcPr>
-            <w:tcW w:type="dxa" w:w="2400"/>
+            <w:tcW w:type="dxa" w:w="2600"/>
             <w:shd w:val="clear" w:color="auto" w:fill="FFFFFF"/>
           </w:tcPr>
           <w:p>
@@ -1295,7 +1369,7 @@
         </w:tc>
         <w:tc>
           <w:tcPr>
-            <w:tcW w:type="dxa" w:w="6626"/>
+            <w:tcW w:type="dxa" w:w="6426"/>
             <w:shd w:val="clear" w:color="auto" w:fill="FFFFFF"/>
           </w:tcPr>
           <w:p>
@@ -1315,7 +1389,7 @@
       <w:tr>
         <w:tc>
           <w:tcPr>
-            <w:tcW w:type="dxa" w:w="2400"/>
+            <w:tcW w:type="dxa" w:w="2600"/>
             <w:shd w:val="clear" w:color="auto" w:fill="F3F4F6"/>
           </w:tcPr>
           <w:p>
@@ -1333,7 +1407,7 @@
         </w:tc>
         <w:tc>
           <w:tcPr>
-            <w:tcW w:type="dxa" w:w="6626"/>
+            <w:tcW w:type="dxa" w:w="6426"/>
             <w:shd w:val="clear" w:color="auto" w:fill="F3F4F6"/>
           </w:tcPr>
           <w:p>
@@ -1893,7 +1967,7 @@
           <w:i w:val="0"/>
           <w:sz w:val="22"/>
         </w:rPr>
-        <w:t>Status: Accepted (revised after design review caught a flaw in the first version of this decision — see Context)</w:t>
+        <w:t>Status: Accepted (revised twice after design review: pass 2 corrected the masking mechanism itself, pass 3 corrected the audit-write mechanism — see Context and Decision)</w:t>
       </w:r>
     </w:p>
     <w:p>
@@ -1950,7 +2024,7 @@
           <w:rFonts w:ascii="Arial" w:hAnsi="Arial"/>
           <w:sz w:val="22"/>
         </w:rPr>
-        <w:t>The original decision specified EF Core global query filters to mask individual ConsentRecord columns. This is not possible: a global query filter is a row-inclusion predicate (HasQueryFilter) — it can only include or exclude an entire row, not redact specific columns within a row that a role otherwise legitimately needs (Teacher needs Status/ExpiryDate from the same row the sensitive fields lived on). The mechanism as originally specified could not deliver the masking it claimed to.</w:t>
+        <w:t>The original decision specified EF Core global query filters to mask individual ConsentRecord columns. This is not possible: a global query filter is a row-inclusion predicate (HasQueryFilter) — it can only include or exclude an entire row, not redact specific columns within a row that a role otherwise legitimately needs (Teacher needs Status/ExpiryDate from the same row the sensitive fields lived on). The mechanism as originally specified could not deliver the masking it claimed to. Fixed at pass 2 by splitting the entity (see Decision §1–2).</w:t>
       </w:r>
     </w:p>
     <w:p>
@@ -1977,6 +2051,19 @@
           <w:sz w:val="22"/>
         </w:rPr>
         <w:t>The original design logged who created/approved a safeguarding record but nothing logged who subsequently read one.</w:t>
+      </w:r>
+    </w:p>
+    <w:p>
+      <w:pPr>
+        <w:pStyle w:val="ListNumber"/>
+        <w:spacing w:after="60"/>
+      </w:pPr>
+      <w:r>
+        <w:rPr>
+          <w:rFonts w:ascii="Arial" w:hAnsi="Arial"/>
+          <w:sz w:val="22"/>
+        </w:rPr>
+        <w:t>Pass 3 found the pass-2 fix for issue 3 was itself under-specified: a DbCommandInterceptor operates on raw ADO.NET commands/CommandText and a forward-only DbDataReader — it has no direct access to EF's typed entity model, so 'detects commands against these two tables and writes the audit row' glossed over how a specific EntityId gets extracted (SQL text-matching is fragile against joins/aliasing; reading the DbDataReader inside the interceptor risks exhausting it before EF materializes from it). It would also miss cache-hit-driven correctness questions the alternative mechanism below doesn't have. Fixed at pass 3 (see Decision §3).</w:t>
       </w:r>
     </w:p>
     <w:p>
@@ -2031,7 +2118,7 @@
           <w:rFonts w:ascii="Arial" w:hAnsi="Arial"/>
           <w:sz w:val="22"/>
         </w:rPr>
-        <w:t>Add a SensitiveDataAccessLog table and write an entry on every read of DbsCheck or ConsentSensitiveDetails (who, what, when, view vs export). Write mechanism: a DbCommandInterceptor (EF Core interceptors) registered globally on the DbContext, which detects commands against these two tables and writes the audit row after successful execution — structural, not a per-repository convention that can be forgotten.</w:t>
+        <w:t>Add a SensitiveDataAccessLog table and write an entry on every read of DbsCheck or ConsentSensitiveDetails (who, what, when, view vs export). Write mechanism (corrected at pass 3): an IMaterializationInterceptor registered on the DbContext. Its InitializedInstance hook fires once per entity instance EF materializes from a query result, giving direct typed access to the entity (entity is DbsCheck dbs → log dbs.Id) — no SQL text-matching, no manual DbDataReader handling, and it fires correctly per row even across EF's compiled-query cache (unlike IQueryExpressionInterceptor, which only fires at query-plan compilation and would silently miss a second call with the same query shape but different parameters — a real risk for an audit-every-read requirement). Because IMaterializationInterceptor is registered as a singleton shared across DbContext instances, the current-user context is resolved per-call via materializationData.Context.GetService&lt;T&gt;(), not cached on the interceptor.</w:t>
       </w:r>
     </w:p>
     <w:p>
@@ -2112,7 +2199,33 @@
           <w:rFonts w:ascii="Arial" w:hAnsi="Arial"/>
           <w:sz w:val="22"/>
         </w:rPr>
-        <w:t>A mandatory repository wrapper method for the audit log write — rejected in favour of the DbCommandInterceptor: a wrapper is opt-in by construction (a new query path could bypass it); the interceptor attaches at the DbContext level and cannot be bypassed without the same explicit IgnoreQueryFilters()-style deliberate act.</w:t>
+        <w:t>A mandatory repository wrapper method for the audit log write — rejected: a wrapper is opt-in by construction (a new query path could bypass it).</w:t>
+      </w:r>
+    </w:p>
+    <w:p>
+      <w:pPr>
+        <w:pStyle w:val="ListBullet"/>
+        <w:spacing w:after="60"/>
+      </w:pPr>
+      <w:r>
+        <w:rPr>
+          <w:rFonts w:ascii="Arial" w:hAnsi="Arial"/>
+          <w:sz w:val="22"/>
+        </w:rPr>
+        <w:t>DbCommandInterceptor (the pass-2 decision) — rejected at pass 3: operates on raw SQL/CommandText and a forward-only DbDataReader, with no direct route to a typed EntityId without fragile text-matching or reader-handling that risks conflicting with EF's own materialization. Kept here as a record of what was under-specified, not as a live option.</w:t>
+      </w:r>
+    </w:p>
+    <w:p>
+      <w:pPr>
+        <w:pStyle w:val="ListBullet"/>
+        <w:spacing w:after="60"/>
+      </w:pPr>
+      <w:r>
+        <w:rPr>
+          <w:rFonts w:ascii="Arial" w:hAnsi="Arial"/>
+          <w:sz w:val="22"/>
+        </w:rPr>
+        <w:t>IQueryExpressionInterceptor — rejected: fires once per query-plan compilation, not per execution, so a second call with the same query shape but a different parameter (e.g. a different student's ConsentSensitiveDetails) would not re-trigger it under EF's compiled-query cache — silently under-recording exactly the reads this control exists to catch.</w:t>
       </w:r>
     </w:p>
     <w:p>

</xml_diff>

<commit_message>
Re-render SRS and ADR after final wording fixes
Only these two documents changed: FR-005 in the SRS now says
ConsentSensitiveDetails, and the ADR document's changelog records
the adr/README.md index correction.
</commit_message>
<xml_diff>
--- a/gates/design/VLMS_ADR.docx
+++ b/gates/design/VLMS_ADR.docx
@@ -201,7 +201,7 @@
                 <w:rFonts w:ascii="Arial" w:hAnsi="Arial"/>
                 <w:sz w:val="20"/>
               </w:rPr>
-              <w:t>1.3</w:t>
+              <w:t>1.4</w:t>
             </w:r>
           </w:p>
         </w:tc>
@@ -892,6 +892,80 @@
           </w:p>
         </w:tc>
       </w:tr>
+      <w:tr>
+        <w:tc>
+          <w:tcPr>
+            <w:tcW w:type="dxa" w:w="1150"/>
+            <w:shd w:val="clear" w:color="auto" w:fill="F3F4F6"/>
+          </w:tcPr>
+          <w:p>
+            <w:pPr>
+              <w:spacing w:after="40" w:before="40"/>
+            </w:pPr>
+            <w:r>
+              <w:rPr>
+                <w:rFonts w:ascii="Arial" w:hAnsi="Arial"/>
+                <w:sz w:val="20"/>
+              </w:rPr>
+              <w:t>1.4</w:t>
+            </w:r>
+          </w:p>
+        </w:tc>
+        <w:tc>
+          <w:tcPr>
+            <w:tcW w:type="dxa" w:w="1500"/>
+            <w:shd w:val="clear" w:color="auto" w:fill="F3F4F6"/>
+          </w:tcPr>
+          <w:p>
+            <w:pPr>
+              <w:spacing w:after="40" w:before="40"/>
+            </w:pPr>
+            <w:r>
+              <w:rPr>
+                <w:rFonts w:ascii="Arial" w:hAnsi="Arial"/>
+                <w:sz w:val="20"/>
+              </w:rPr>
+              <w:t>17 July 2026</w:t>
+            </w:r>
+          </w:p>
+        </w:tc>
+        <w:tc>
+          <w:tcPr>
+            <w:tcW w:type="dxa" w:w="2700"/>
+            <w:shd w:val="clear" w:color="auto" w:fill="F3F4F6"/>
+          </w:tcPr>
+          <w:p>
+            <w:pPr>
+              <w:spacing w:after="40" w:before="40"/>
+            </w:pPr>
+            <w:r>
+              <w:rPr>
+                <w:rFonts w:ascii="Arial" w:hAnsi="Arial"/>
+                <w:sz w:val="20"/>
+              </w:rPr>
+              <w:t>Philip</w:t>
+            </w:r>
+          </w:p>
+        </w:tc>
+        <w:tc>
+          <w:tcPr>
+            <w:tcW w:type="dxa" w:w="3676"/>
+            <w:shd w:val="clear" w:color="auto" w:fill="F3F4F6"/>
+          </w:tcPr>
+          <w:p>
+            <w:pPr>
+              <w:spacing w:after="40" w:before="40"/>
+            </w:pPr>
+            <w:r>
+              <w:rPr>
+                <w:rFonts w:ascii="Arial" w:hAnsi="Arial"/>
+                <w:sz w:val="20"/>
+              </w:rPr>
+              <w:t>Re-render addressing fourth design-gate review (no Critical/Important findings — a documentation-hygiene pass only): adr/README.md's one-line index entry for ADR-0004 still paired the superseded DbCommandInterceptor/ConsentRecord wording instead of IMaterializationInterceptor/ConsentSensitiveDetails; source corrected. ADR-0004's own body text (Context, Decision, Alternatives, Consequences below) already used the corrected terminology throughout as of v1.3 and is unchanged by this pass; same stale-wording defect class as the third-review NFR-001 fix.</w:t>
+            </w:r>
+          </w:p>
+        </w:tc>
+      </w:tr>
     </w:tbl>
     <w:p>
       <w:pPr>
@@ -939,7 +1013,7 @@
         <w:rPr>
           <w:rFonts w:ascii="Arial" w:hAnsi="Arial"/>
           <w:b w:val="0"/>
-          <w:i/>
+          <w:i w:val="0"/>
           <w:sz w:val="22"/>
         </w:rPr>
         <w:t>Format: Nygard / MADR (context, decision, status, consequences, alternatives). ADRs are added as new decisions are made during design (adr/README.md). Four ADRs are recorded at this gate; ADR-0004 has been revised twice, at the second and third design reviews.</w:t>
@@ -948,15 +1022,15 @@
     <w:p>
       <w:pPr>
         <w:keepNext/>
-        <w:spacing w:before="280" w:after="120"/>
-        <w:outlineLvl w:val="0"/>
+        <w:spacing w:before="200" w:after="80"/>
+        <w:outlineLvl w:val="1"/>
       </w:pPr>
       <w:r>
         <w:rPr>
           <w:rFonts w:ascii="Arial" w:hAnsi="Arial"/>
           <w:b/>
-          <w:color w:val="111827"/>
-          <w:sz w:val="32"/>
+          <w:color w:val="1F2937"/>
+          <w:sz w:val="26"/>
         </w:rPr>
         <w:t>ADR-0001: Technology stack — Blazor + Azure</w:t>
       </w:r>
@@ -979,14 +1053,14 @@
       <w:pPr>
         <w:keepNext/>
         <w:spacing w:before="200" w:after="80"/>
-        <w:outlineLvl w:val="1"/>
+        <w:outlineLvl w:val="2"/>
       </w:pPr>
       <w:r>
         <w:rPr>
           <w:rFonts w:ascii="Arial" w:hAnsi="Arial"/>
           <w:b/>
-          <w:color w:val="1F2937"/>
-          <w:sz w:val="26"/>
+          <w:color w:val="374151"/>
+          <w:sz w:val="24"/>
         </w:rPr>
         <w:t>Context</w:t>
       </w:r>
@@ -1086,14 +1160,14 @@
       <w:pPr>
         <w:keepNext/>
         <w:spacing w:before="200" w:after="80"/>
-        <w:outlineLvl w:val="1"/>
+        <w:outlineLvl w:val="2"/>
       </w:pPr>
       <w:r>
         <w:rPr>
           <w:rFonts w:ascii="Arial" w:hAnsi="Arial"/>
           <w:b/>
-          <w:color w:val="1F2937"/>
-          <w:sz w:val="26"/>
+          <w:color w:val="374151"/>
+          <w:sz w:val="24"/>
         </w:rPr>
         <w:t>Decision</w:t>
       </w:r>
@@ -1119,7 +1193,7 @@
       <w:tr>
         <w:tc>
           <w:tcPr>
-            <w:tcW w:type="dxa" w:w="2600"/>
+            <w:tcW w:type="dxa" w:w="2200"/>
             <w:shd w:val="clear" w:color="auto" w:fill="374151"/>
           </w:tcPr>
           <w:p>
@@ -1139,7 +1213,7 @@
         </w:tc>
         <w:tc>
           <w:tcPr>
-            <w:tcW w:type="dxa" w:w="6426"/>
+            <w:tcW w:type="dxa" w:w="6826"/>
             <w:shd w:val="clear" w:color="auto" w:fill="374151"/>
           </w:tcPr>
           <w:p>
@@ -1161,7 +1235,7 @@
       <w:tr>
         <w:tc>
           <w:tcPr>
-            <w:tcW w:type="dxa" w:w="2600"/>
+            <w:tcW w:type="dxa" w:w="2200"/>
             <w:shd w:val="clear" w:color="auto" w:fill="F3F4F6"/>
           </w:tcPr>
           <w:p>
@@ -1179,7 +1253,7 @@
         </w:tc>
         <w:tc>
           <w:tcPr>
-            <w:tcW w:type="dxa" w:w="6426"/>
+            <w:tcW w:type="dxa" w:w="6826"/>
             <w:shd w:val="clear" w:color="auto" w:fill="F3F4F6"/>
           </w:tcPr>
           <w:p>
@@ -1199,7 +1273,7 @@
       <w:tr>
         <w:tc>
           <w:tcPr>
-            <w:tcW w:type="dxa" w:w="2600"/>
+            <w:tcW w:type="dxa" w:w="2200"/>
             <w:shd w:val="clear" w:color="auto" w:fill="FFFFFF"/>
           </w:tcPr>
           <w:p>
@@ -1217,7 +1291,7 @@
         </w:tc>
         <w:tc>
           <w:tcPr>
-            <w:tcW w:type="dxa" w:w="6426"/>
+            <w:tcW w:type="dxa" w:w="6826"/>
             <w:shd w:val="clear" w:color="auto" w:fill="FFFFFF"/>
           </w:tcPr>
           <w:p>
@@ -1237,7 +1311,7 @@
       <w:tr>
         <w:tc>
           <w:tcPr>
-            <w:tcW w:type="dxa" w:w="2600"/>
+            <w:tcW w:type="dxa" w:w="2200"/>
             <w:shd w:val="clear" w:color="auto" w:fill="F3F4F6"/>
           </w:tcPr>
           <w:p>
@@ -1255,7 +1329,7 @@
         </w:tc>
         <w:tc>
           <w:tcPr>
-            <w:tcW w:type="dxa" w:w="6426"/>
+            <w:tcW w:type="dxa" w:w="6826"/>
             <w:shd w:val="clear" w:color="auto" w:fill="F3F4F6"/>
           </w:tcPr>
           <w:p>
@@ -1275,7 +1349,7 @@
       <w:tr>
         <w:tc>
           <w:tcPr>
-            <w:tcW w:type="dxa" w:w="2600"/>
+            <w:tcW w:type="dxa" w:w="2200"/>
             <w:shd w:val="clear" w:color="auto" w:fill="FFFFFF"/>
           </w:tcPr>
           <w:p>
@@ -1293,7 +1367,7 @@
         </w:tc>
         <w:tc>
           <w:tcPr>
-            <w:tcW w:type="dxa" w:w="6426"/>
+            <w:tcW w:type="dxa" w:w="6826"/>
             <w:shd w:val="clear" w:color="auto" w:fill="FFFFFF"/>
           </w:tcPr>
           <w:p>
@@ -1313,7 +1387,7 @@
       <w:tr>
         <w:tc>
           <w:tcPr>
-            <w:tcW w:type="dxa" w:w="2600"/>
+            <w:tcW w:type="dxa" w:w="2200"/>
             <w:shd w:val="clear" w:color="auto" w:fill="F3F4F6"/>
           </w:tcPr>
           <w:p>
@@ -1331,7 +1405,7 @@
         </w:tc>
         <w:tc>
           <w:tcPr>
-            <w:tcW w:type="dxa" w:w="6426"/>
+            <w:tcW w:type="dxa" w:w="6826"/>
             <w:shd w:val="clear" w:color="auto" w:fill="F3F4F6"/>
           </w:tcPr>
           <w:p>
@@ -1351,7 +1425,7 @@
       <w:tr>
         <w:tc>
           <w:tcPr>
-            <w:tcW w:type="dxa" w:w="2600"/>
+            <w:tcW w:type="dxa" w:w="2200"/>
             <w:shd w:val="clear" w:color="auto" w:fill="FFFFFF"/>
           </w:tcPr>
           <w:p>
@@ -1369,7 +1443,7 @@
         </w:tc>
         <w:tc>
           <w:tcPr>
-            <w:tcW w:type="dxa" w:w="6426"/>
+            <w:tcW w:type="dxa" w:w="6826"/>
             <w:shd w:val="clear" w:color="auto" w:fill="FFFFFF"/>
           </w:tcPr>
           <w:p>
@@ -1389,7 +1463,7 @@
       <w:tr>
         <w:tc>
           <w:tcPr>
-            <w:tcW w:type="dxa" w:w="2600"/>
+            <w:tcW w:type="dxa" w:w="2200"/>
             <w:shd w:val="clear" w:color="auto" w:fill="F3F4F6"/>
           </w:tcPr>
           <w:p>
@@ -1407,7 +1481,7 @@
         </w:tc>
         <w:tc>
           <w:tcPr>
-            <w:tcW w:type="dxa" w:w="6426"/>
+            <w:tcW w:type="dxa" w:w="6826"/>
             <w:shd w:val="clear" w:color="auto" w:fill="F3F4F6"/>
           </w:tcPr>
           <w:p>
@@ -1434,14 +1508,14 @@
       <w:pPr>
         <w:keepNext/>
         <w:spacing w:before="200" w:after="80"/>
-        <w:outlineLvl w:val="1"/>
+        <w:outlineLvl w:val="2"/>
       </w:pPr>
       <w:r>
         <w:rPr>
           <w:rFonts w:ascii="Arial" w:hAnsi="Arial"/>
           <w:b/>
-          <w:color w:val="1F2937"/>
-          <w:sz w:val="26"/>
+          <w:color w:val="374151"/>
+          <w:sz w:val="24"/>
         </w:rPr>
         <w:t>Alternatives considered</w:t>
       </w:r>
@@ -1528,14 +1602,14 @@
       <w:pPr>
         <w:keepNext/>
         <w:spacing w:before="200" w:after="80"/>
-        <w:outlineLvl w:val="1"/>
+        <w:outlineLvl w:val="2"/>
       </w:pPr>
       <w:r>
         <w:rPr>
           <w:rFonts w:ascii="Arial" w:hAnsi="Arial"/>
           <w:b/>
-          <w:color w:val="1F2937"/>
-          <w:sz w:val="26"/>
+          <w:color w:val="374151"/>
+          <w:sz w:val="24"/>
         </w:rPr>
         <w:t>Consequences</w:t>
       </w:r>
@@ -1595,15 +1669,15 @@
     <w:p>
       <w:pPr>
         <w:keepNext/>
-        <w:spacing w:before="280" w:after="120"/>
-        <w:outlineLvl w:val="0"/>
+        <w:spacing w:before="200" w:after="80"/>
+        <w:outlineLvl w:val="1"/>
       </w:pPr>
       <w:r>
         <w:rPr>
           <w:rFonts w:ascii="Arial" w:hAnsi="Arial"/>
           <w:b/>
-          <w:color w:val="111827"/>
-          <w:sz w:val="32"/>
+          <w:color w:val="1F2937"/>
+          <w:sz w:val="26"/>
         </w:rPr>
         <w:t>ADR-0002: User roles modelled as application claims, not native Entra External ID groups</w:t>
       </w:r>
@@ -1626,14 +1700,14 @@
       <w:pPr>
         <w:keepNext/>
         <w:spacing w:before="200" w:after="80"/>
-        <w:outlineLvl w:val="1"/>
+        <w:outlineLvl w:val="2"/>
       </w:pPr>
       <w:r>
         <w:rPr>
           <w:rFonts w:ascii="Arial" w:hAnsi="Arial"/>
           <w:b/>
-          <w:color w:val="1F2937"/>
-          <w:sz w:val="26"/>
+          <w:color w:val="374151"/>
+          <w:sz w:val="24"/>
         </w:rPr>
         <w:t>Context</w:t>
       </w:r>
@@ -1656,14 +1730,14 @@
       <w:pPr>
         <w:keepNext/>
         <w:spacing w:before="200" w:after="80"/>
-        <w:outlineLvl w:val="1"/>
+        <w:outlineLvl w:val="2"/>
       </w:pPr>
       <w:r>
         <w:rPr>
           <w:rFonts w:ascii="Arial" w:hAnsi="Arial"/>
           <w:b/>
-          <w:color w:val="1F2937"/>
-          <w:sz w:val="26"/>
+          <w:color w:val="374151"/>
+          <w:sz w:val="24"/>
         </w:rPr>
         <w:t>Decision</w:t>
       </w:r>
@@ -1686,14 +1760,14 @@
       <w:pPr>
         <w:keepNext/>
         <w:spacing w:before="200" w:after="80"/>
-        <w:outlineLvl w:val="1"/>
+        <w:outlineLvl w:val="2"/>
       </w:pPr>
       <w:r>
         <w:rPr>
           <w:rFonts w:ascii="Arial" w:hAnsi="Arial"/>
           <w:b/>
-          <w:color w:val="1F2937"/>
-          <w:sz w:val="26"/>
+          <w:color w:val="374151"/>
+          <w:sz w:val="24"/>
         </w:rPr>
         <w:t>Alternatives considered</w:t>
       </w:r>
@@ -1715,14 +1789,14 @@
       <w:pPr>
         <w:keepNext/>
         <w:spacing w:before="200" w:after="80"/>
-        <w:outlineLvl w:val="1"/>
+        <w:outlineLvl w:val="2"/>
       </w:pPr>
       <w:r>
         <w:rPr>
           <w:rFonts w:ascii="Arial" w:hAnsi="Arial"/>
           <w:b/>
-          <w:color w:val="1F2937"/>
-          <w:sz w:val="26"/>
+          <w:color w:val="374151"/>
+          <w:sz w:val="24"/>
         </w:rPr>
         <w:t>Consequences</w:t>
       </w:r>
@@ -1769,15 +1843,15 @@
     <w:p>
       <w:pPr>
         <w:keepNext/>
-        <w:spacing w:before="280" w:after="120"/>
-        <w:outlineLvl w:val="0"/>
+        <w:spacing w:before="200" w:after="80"/>
+        <w:outlineLvl w:val="1"/>
       </w:pPr>
       <w:r>
         <w:rPr>
           <w:rFonts w:ascii="Arial" w:hAnsi="Arial"/>
           <w:b/>
-          <w:color w:val="111827"/>
-          <w:sz w:val="32"/>
+          <w:color w:val="1F2937"/>
+          <w:sz w:val="26"/>
         </w:rPr>
         <w:t>ADR-0003: Scheduled/background work via Azure App Service WebJobs</w:t>
       </w:r>
@@ -1800,14 +1874,14 @@
       <w:pPr>
         <w:keepNext/>
         <w:spacing w:before="200" w:after="80"/>
-        <w:outlineLvl w:val="1"/>
+        <w:outlineLvl w:val="2"/>
       </w:pPr>
       <w:r>
         <w:rPr>
           <w:rFonts w:ascii="Arial" w:hAnsi="Arial"/>
           <w:b/>
-          <w:color w:val="1F2937"/>
-          <w:sz w:val="26"/>
+          <w:color w:val="374151"/>
+          <w:sz w:val="24"/>
         </w:rPr>
         <w:t>Context</w:t>
       </w:r>
@@ -1830,14 +1904,14 @@
       <w:pPr>
         <w:keepNext/>
         <w:spacing w:before="200" w:after="80"/>
-        <w:outlineLvl w:val="1"/>
+        <w:outlineLvl w:val="2"/>
       </w:pPr>
       <w:r>
         <w:rPr>
           <w:rFonts w:ascii="Arial" w:hAnsi="Arial"/>
           <w:b/>
-          <w:color w:val="1F2937"/>
-          <w:sz w:val="26"/>
+          <w:color w:val="374151"/>
+          <w:sz w:val="24"/>
         </w:rPr>
         <w:t>Decision</w:t>
       </w:r>
@@ -1860,14 +1934,14 @@
       <w:pPr>
         <w:keepNext/>
         <w:spacing w:before="200" w:after="80"/>
-        <w:outlineLvl w:val="1"/>
+        <w:outlineLvl w:val="2"/>
       </w:pPr>
       <w:r>
         <w:rPr>
           <w:rFonts w:ascii="Arial" w:hAnsi="Arial"/>
           <w:b/>
-          <w:color w:val="1F2937"/>
-          <w:sz w:val="26"/>
+          <w:color w:val="374151"/>
+          <w:sz w:val="24"/>
         </w:rPr>
         <w:t>Alternatives considered</w:t>
       </w:r>
@@ -1889,14 +1963,14 @@
       <w:pPr>
         <w:keepNext/>
         <w:spacing w:before="200" w:after="80"/>
-        <w:outlineLvl w:val="1"/>
+        <w:outlineLvl w:val="2"/>
       </w:pPr>
       <w:r>
         <w:rPr>
           <w:rFonts w:ascii="Arial" w:hAnsi="Arial"/>
           <w:b/>
-          <w:color w:val="1F2937"/>
-          <w:sz w:val="26"/>
+          <w:color w:val="374151"/>
+          <w:sz w:val="24"/>
         </w:rPr>
         <w:t>Consequences</w:t>
       </w:r>
@@ -1943,15 +2017,15 @@
     <w:p>
       <w:pPr>
         <w:keepNext/>
-        <w:spacing w:before="280" w:after="120"/>
-        <w:outlineLvl w:val="0"/>
+        <w:spacing w:before="200" w:after="80"/>
+        <w:outlineLvl w:val="1"/>
       </w:pPr>
       <w:r>
         <w:rPr>
           <w:rFonts w:ascii="Arial" w:hAnsi="Arial"/>
           <w:b/>
-          <w:color w:val="111827"/>
-          <w:sz w:val="32"/>
+          <w:color w:val="1F2937"/>
+          <w:sz w:val="26"/>
         </w:rPr>
         <w:t>ADR-0004: Sensitive data access control — entity split + EF Core query filters + read audit log</w:t>
       </w:r>
@@ -1974,14 +2048,14 @@
       <w:pPr>
         <w:keepNext/>
         <w:spacing w:before="200" w:after="80"/>
-        <w:outlineLvl w:val="1"/>
+        <w:outlineLvl w:val="2"/>
       </w:pPr>
       <w:r>
         <w:rPr>
           <w:rFonts w:ascii="Arial" w:hAnsi="Arial"/>
           <w:b/>
-          <w:color w:val="1F2937"/>
-          <w:sz w:val="26"/>
+          <w:color w:val="374151"/>
+          <w:sz w:val="24"/>
         </w:rPr>
         <w:t>Context</w:t>
       </w:r>
@@ -2070,14 +2144,14 @@
       <w:pPr>
         <w:keepNext/>
         <w:spacing w:before="200" w:after="80"/>
-        <w:outlineLvl w:val="1"/>
+        <w:outlineLvl w:val="2"/>
       </w:pPr>
       <w:r>
         <w:rPr>
           <w:rFonts w:ascii="Arial" w:hAnsi="Arial"/>
           <w:b/>
-          <w:color w:val="1F2937"/>
-          <w:sz w:val="26"/>
+          <w:color w:val="374151"/>
+          <w:sz w:val="24"/>
         </w:rPr>
         <w:t>Decision</w:t>
       </w:r>
@@ -2138,14 +2212,14 @@
       <w:pPr>
         <w:keepNext/>
         <w:spacing w:before="200" w:after="80"/>
-        <w:outlineLvl w:val="1"/>
+        <w:outlineLvl w:val="2"/>
       </w:pPr>
       <w:r>
         <w:rPr>
           <w:rFonts w:ascii="Arial" w:hAnsi="Arial"/>
           <w:b/>
-          <w:color w:val="1F2937"/>
-          <w:sz w:val="26"/>
+          <w:color w:val="374151"/>
+          <w:sz w:val="24"/>
         </w:rPr>
         <w:t>Alternatives considered</w:t>
       </w:r>
@@ -2232,14 +2306,14 @@
       <w:pPr>
         <w:keepNext/>
         <w:spacing w:before="200" w:after="80"/>
-        <w:outlineLvl w:val="1"/>
+        <w:outlineLvl w:val="2"/>
       </w:pPr>
       <w:r>
         <w:rPr>
           <w:rFonts w:ascii="Arial" w:hAnsi="Arial"/>
           <w:b/>
-          <w:color w:val="1F2937"/>
-          <w:sz w:val="26"/>
+          <w:color w:val="374151"/>
+          <w:sz w:val="24"/>
         </w:rPr>
         <w:t>Consequences</w:t>
       </w:r>

</xml_diff>